<commit_message>
Fix formatting and stale statement references
- Correct chapter 1 companion reference to cover M1 through M9
- Correct lifecycle checklist header to cite PS1 to PS3, PS5 to PS9, and
  reorder the request-path checkboxes ahead of emergency access to match
  the heading order; apply the same two changes to the Word twin
- Convert the TERMINOLOGY glossary and the single-file Contents block to
  bullet lists so they no longer render as run-on paragraphs on GitHub
- Add hard line breaks to the charter template field blocks so labelled
  fields render one per line
- Promote the metrics telemetry catalogue subsections from H4 to H3 to
  remove a skipped heading level
- Normalize blank lines around headings, paragraphs, and footer rules;
  remove a stray leading space in the licence section
- Mirror every shared-passage fix in the single-file reading edition
</commit_message>
<xml_diff>
--- a/companions/docx/iga-lifecycle-checklist.docx
+++ b/companions/docx/iga-lifecycle-checklist.docx
@@ -21,7 +21,7 @@
           <w:i/>
           <w:iCs/>
         </w:rPr>
-        <w:t xml:space="preserve">Companion worksheet for chapter 5 (Process). Work through each block; every unchecked box is a defined gap. Statements referenced: PS1 to PS3, PS5 to PS8.</w:t>
+        <w:t xml:space="preserve">Companion worksheet for chapter 5 (Process). Work through each block; every unchecked box is a defined gap. Statements referenced: PS1 to PS3, PS5 to PS9.</w:t>
       </w:r>
     </w:p>
     <w:p>
@@ -540,6 +540,78 @@
           <w:i w:val="false"/>
           <w:iCs w:val="false"/>
         </w:rPr>
+        <w:t xml:space="preserve">Intake is defined and is the only path</w:t>
+      </w:r>
+    </w:p>
+    <w:p>
+      <w:pPr>
+        <w:spacing w:after="80"/>
+        <w:ind w:left="460" w:hanging="300"/>
+      </w:pPr>
+      <w:r>
+        <w:t xml:space="preserve">☐  </w:t>
+      </w:r>
+      <w:r>
+        <w:rPr>
+          <w:b w:val="false"/>
+          <w:bCs w:val="false"/>
+          <w:i w:val="false"/>
+          <w:iCs w:val="false"/>
+        </w:rPr>
+        <w:t xml:space="preserve">Approval chain depth follows tier (chapter 4, P2)</w:t>
+      </w:r>
+    </w:p>
+    <w:p>
+      <w:pPr>
+        <w:spacing w:after="80"/>
+        <w:ind w:left="460" w:hanging="300"/>
+      </w:pPr>
+      <w:r>
+        <w:t xml:space="preserve">☐  </w:t>
+      </w:r>
+      <w:r>
+        <w:rPr>
+          <w:b w:val="false"/>
+          <w:bCs w:val="false"/>
+          <w:i w:val="false"/>
+          <w:iCs w:val="false"/>
+        </w:rPr>
+        <w:t xml:space="preserve">Each stage carries a time bound</w:t>
+      </w:r>
+    </w:p>
+    <w:p>
+      <w:pPr>
+        <w:spacing w:after="80"/>
+        <w:ind w:left="460" w:hanging="300"/>
+      </w:pPr>
+      <w:r>
+        <w:t xml:space="preserve">☐  </w:t>
+      </w:r>
+      <w:r>
+        <w:rPr>
+          <w:b w:val="false"/>
+          <w:bCs w:val="false"/>
+          <w:i w:val="false"/>
+          <w:iCs w:val="false"/>
+        </w:rPr>
+        <w:t xml:space="preserve">Reconciliation detects grants made outside the path, and each is reversed or regularized</w:t>
+      </w:r>
+    </w:p>
+    <w:p>
+      <w:pPr>
+        <w:spacing w:after="80"/>
+        <w:ind w:left="460" w:hanging="300"/>
+      </w:pPr>
+      <w:r>
+        <w:t xml:space="preserve">☐  </w:t>
+      </w:r>
+      <w:r>
+        <w:rPr>
+          <w:b w:val="false"/>
+          <w:bCs w:val="false"/>
+          <w:i w:val="false"/>
+          <w:iCs w:val="false"/>
+        </w:rPr>
         <w:t xml:space="preserve">Emergency access is defined in advance: who may invoke it, for which systems, through what mechanism</w:t>
       </w:r>
     </w:p>
@@ -559,78 +631,6 @@
           <w:iCs w:val="false"/>
         </w:rPr>
         <w:t xml:space="preserve">Every emergency use is logged at invocation, expires automatically, and receives a post-use review</w:t>
-      </w:r>
-    </w:p>
-    <w:p>
-      <w:pPr>
-        <w:spacing w:after="80"/>
-        <w:ind w:left="460" w:hanging="300"/>
-      </w:pPr>
-      <w:r>
-        <w:t xml:space="preserve">☐  </w:t>
-      </w:r>
-      <w:r>
-        <w:rPr>
-          <w:b w:val="false"/>
-          <w:bCs w:val="false"/>
-          <w:i w:val="false"/>
-          <w:iCs w:val="false"/>
-        </w:rPr>
-        <w:t xml:space="preserve">Intake is defined and is the only path</w:t>
-      </w:r>
-    </w:p>
-    <w:p>
-      <w:pPr>
-        <w:spacing w:after="80"/>
-        <w:ind w:left="460" w:hanging="300"/>
-      </w:pPr>
-      <w:r>
-        <w:t xml:space="preserve">☐  </w:t>
-      </w:r>
-      <w:r>
-        <w:rPr>
-          <w:b w:val="false"/>
-          <w:bCs w:val="false"/>
-          <w:i w:val="false"/>
-          <w:iCs w:val="false"/>
-        </w:rPr>
-        <w:t xml:space="preserve">Approval chain depth follows tier (chapter 4, P2)</w:t>
-      </w:r>
-    </w:p>
-    <w:p>
-      <w:pPr>
-        <w:spacing w:after="80"/>
-        <w:ind w:left="460" w:hanging="300"/>
-      </w:pPr>
-      <w:r>
-        <w:t xml:space="preserve">☐  </w:t>
-      </w:r>
-      <w:r>
-        <w:rPr>
-          <w:b w:val="false"/>
-          <w:bCs w:val="false"/>
-          <w:i w:val="false"/>
-          <w:iCs w:val="false"/>
-        </w:rPr>
-        <w:t xml:space="preserve">Each stage carries a time bound</w:t>
-      </w:r>
-    </w:p>
-    <w:p>
-      <w:pPr>
-        <w:spacing w:after="80"/>
-        <w:ind w:left="460" w:hanging="300"/>
-      </w:pPr>
-      <w:r>
-        <w:t xml:space="preserve">☐  </w:t>
-      </w:r>
-      <w:r>
-        <w:rPr>
-          <w:b w:val="false"/>
-          <w:bCs w:val="false"/>
-          <w:i w:val="false"/>
-          <w:iCs w:val="false"/>
-        </w:rPr>
-        <w:t xml:space="preserve">Reconciliation detects grants made outside the path, and each is reversed or regularized</w:t>
       </w:r>
     </w:p>
     <w:p>

</xml_diff>